<commit_message>
updates to chapter 5
</commit_message>
<xml_diff>
--- a/docs/lectures/Chapter05_Lecture_FIXED.docx
+++ b/docs/lectures/Chapter05_Lecture_FIXED.docx
@@ -23,7 +23,7 @@
         <w:pStyle w:val="Date"/>
       </w:pPr>
       <w:r>
-        <w:t xml:space="preserve">2026-03-01</w:t>
+        <w:t xml:space="preserve">2026-03-03</w:t>
       </w:r>
     </w:p>
     <w:sdt>
@@ -52,7 +52,7 @@
         </w:p>
       </w:sdtContent>
     </w:sdt>
-    <w:bookmarkStart w:id="100" w:name="introduction"/>
+    <w:bookmarkStart w:id="89" w:name="introduction"/>
     <w:p>
       <w:pPr>
         <w:pStyle w:val="Heading1"/>
@@ -792,7 +792,7 @@
         <w:br/>
       </w:r>
       <w:r>
-        <w:t xml:space="preserve">It’s overwhelmingly an electronic, global, OTC network.</w:t>
+        <w:t xml:space="preserve">It’s overwhelmingly an electronic, global, Over the Counter (OTC) network (in other words, customizable, and not a central exchange).</w:t>
       </w:r>
     </w:p>
     <w:p>
@@ -2167,7 +2167,7 @@
     </w:p>
     <w:bookmarkEnd w:id="45"/>
     <w:bookmarkEnd w:id="46"/>
-    <w:bookmarkStart w:id="71" w:name="X7f2222850c62f5942d0082fad4c7399e863598e"/>
+    <w:bookmarkStart w:id="67" w:name="X7f2222850c62f5942d0082fad4c7399e863598e"/>
     <w:p>
       <w:pPr>
         <w:pStyle w:val="Heading2"/>
@@ -2705,7 +2705,7 @@
           <w:b/>
           <w:bCs/>
         </w:rPr>
-        <w:t xml:space="preserve">Teaching anchor:</w:t>
+        <w:t xml:space="preserve">Note:</w:t>
       </w:r>
       <w:r>
         <w:t xml:space="preserve"> </w:t>
@@ -3014,11 +3014,21 @@
         <w:pStyle w:val="BodyText"/>
       </w:pPr>
       <w:r>
-        <w:t xml:space="preserve">Classroom point: London’s role as a global hub reflects time zone overlap, institutional depth, and historical network effects.</w:t>
+        <w:rPr>
+          <w:b/>
+          <w:bCs/>
+        </w:rPr>
+        <w:t xml:space="preserve">Note:</w:t>
+      </w:r>
+      <w:r>
+        <w:t xml:space="preserve"> </w:t>
+      </w:r>
+      <w:r>
+        <w:t xml:space="preserve">London’s role as a global hub reflects time zone overlap, institutional depth, and historical network effects.</w:t>
       </w:r>
     </w:p>
     <w:bookmarkEnd w:id="64"/>
-    <w:bookmarkStart w:id="68" w:name="currency-composition"/>
+    <w:bookmarkStart w:id="65" w:name="currency-composition"/>
     <w:p>
       <w:pPr>
         <w:pStyle w:val="Heading3"/>
@@ -3029,62 +3039,7 @@
     </w:p>
     <w:p>
       <w:pPr>
-        <w:pStyle w:val="CaptionedFigure"/>
-      </w:pPr>
-      <w:r>
-        <w:drawing>
-          <wp:inline>
-            <wp:extent cx="4800600" cy="3600450"/>
-            <wp:effectExtent b="0" l="0" r="0" t="0"/>
-            <wp:docPr descr="Daily FX Trading by Currency Pair" title="" id="66" name="Picture"/>
-            <a:graphic>
-              <a:graphicData uri="http://schemas.openxmlformats.org/drawingml/2006/picture">
-                <pic:pic>
-                  <pic:nvPicPr>
-                    <pic:cNvPr descr="../assets/images/Ch05/Exhibit_5.8_currency_composition.png" id="67" name="Picture"/>
-                    <pic:cNvPicPr>
-                      <a:picLocks noChangeArrowheads="1" noChangeAspect="1"/>
-                    </pic:cNvPicPr>
-                  </pic:nvPicPr>
-                  <pic:blipFill>
-                    <a:blip r:embed="rId65"/>
-                    <a:stretch>
-                      <a:fillRect/>
-                    </a:stretch>
-                  </pic:blipFill>
-                  <pic:spPr bwMode="auto">
-                    <a:xfrm>
-                      <a:off x="0" y="0"/>
-                      <a:ext cx="4800600" cy="3600450"/>
-                    </a:xfrm>
-                    <a:prstGeom prst="rect">
-                      <a:avLst/>
-                    </a:prstGeom>
-                    <a:noFill/>
-                    <a:ln w="9525">
-                      <a:noFill/>
-                      <a:headEnd/>
-                      <a:tailEnd/>
-                    </a:ln>
-                  </pic:spPr>
-                </pic:pic>
-              </a:graphicData>
-            </a:graphic>
-          </wp:inline>
-        </w:drawing>
-      </w:r>
-    </w:p>
-    <w:p>
-      <w:pPr>
-        <w:pStyle w:val="ImageCaption"/>
-      </w:pPr>
-      <w:r>
-        <w:t xml:space="preserve">Daily FX Trading by Currency Pair</w:t>
-      </w:r>
-    </w:p>
-    <w:p>
-      <w:pPr>
-        <w:pStyle w:val="BodyText"/>
+        <w:pStyle w:val="FirstParagraph"/>
       </w:pPr>
       <w:r>
         <w:t xml:space="preserve">The U.S. dollar appears on one side of most trades. That does</w:t>
@@ -3122,14 +3077,14 @@
         <w:t xml:space="preserve">used to move between two less-liquid currencies.</w:t>
       </w:r>
     </w:p>
-    <w:bookmarkEnd w:id="68"/>
-    <w:bookmarkStart w:id="69" w:name="likely-student-misconceptions"/>
+    <w:bookmarkEnd w:id="65"/>
+    <w:bookmarkStart w:id="66" w:name="common-misconceptions-1"/>
     <w:p>
       <w:pPr>
         <w:pStyle w:val="Heading3"/>
       </w:pPr>
       <w:r>
-        <w:t xml:space="preserve">5.3.8 Likely student misconceptions</w:t>
+        <w:t xml:space="preserve">5.3.8 Common misconceptions</w:t>
       </w:r>
     </w:p>
     <w:p>
@@ -3151,7 +3106,13 @@
         <w:br/>
       </w:r>
       <w:r>
-        <w:t xml:space="preserve">In interbank markets it typically settles T+2.</w:t>
+        <w:t xml:space="preserve">In interbank markets it typically settles T+2 (</w:t>
+      </w:r>
+      <w:r>
+        <w:t xml:space="preserve">“by day after tomorrow”</w:t>
+      </w:r>
+      <w:r>
+        <w:t xml:space="preserve">).</w:t>
       </w:r>
     </w:p>
     <w:p>
@@ -3212,40 +3173,6 @@
       </w:r>
       <w:r>
         <w:t xml:space="preserve">volume category because funding and liquidity management is constant.</w:t>
-      </w:r>
-    </w:p>
-    <w:bookmarkEnd w:id="69"/>
-    <w:bookmarkStart w:id="70" w:name="check-for-understanding"/>
-    <w:p>
-      <w:pPr>
-        <w:pStyle w:val="Heading3"/>
-      </w:pPr>
-      <w:r>
-        <w:t xml:space="preserve">5.3.9 Check for understanding</w:t>
-      </w:r>
-    </w:p>
-    <w:p>
-      <w:pPr>
-        <w:pStyle w:val="Compact"/>
-        <w:numPr>
-          <w:ilvl w:val="0"/>
-          <w:numId w:val="1028"/>
-        </w:numPr>
-      </w:pPr>
-      <w:r>
-        <w:t xml:space="preserve">A U.S. firm will pay JPY in 3 months. What FX instrument most directly locks in the USD cost today?</w:t>
-      </w:r>
-    </w:p>
-    <w:p>
-      <w:pPr>
-        <w:pStyle w:val="Compact"/>
-        <w:numPr>
-          <w:ilvl w:val="0"/>
-          <w:numId w:val="1028"/>
-        </w:numPr>
-      </w:pPr>
-      <w:r>
-        <w:t xml:space="preserve">Why might a bank use swaps repeatedly rather than a single long-dated forward?</w:t>
       </w:r>
     </w:p>
     <w:p>
@@ -3255,9 +3182,9 @@
         </w:pict>
       </w:r>
     </w:p>
-    <w:bookmarkEnd w:id="70"/>
-    <w:bookmarkEnd w:id="71"/>
-    <w:bookmarkStart w:id="98" w:name="foreign-exchange-rates-and-quotations"/>
+    <w:bookmarkEnd w:id="66"/>
+    <w:bookmarkEnd w:id="67"/>
+    <w:bookmarkStart w:id="87" w:name="foreign-exchange-rates-and-quotations"/>
     <w:p>
       <w:pPr>
         <w:pStyle w:val="Heading2"/>
@@ -3266,7 +3193,7 @@
         <w:t xml:space="preserve">5.4 Foreign Exchange Rates and Quotations</w:t>
       </w:r>
     </w:p>
-    <w:bookmarkStart w:id="72" w:name="currency-symbols-and-iso-codes"/>
+    <w:bookmarkStart w:id="68" w:name="currency-symbols-and-iso-codes"/>
     <w:p>
       <w:pPr>
         <w:pStyle w:val="Heading3"/>
@@ -3288,7 +3215,7 @@
         <w:pStyle w:val="Compact"/>
         <w:numPr>
           <w:ilvl w:val="0"/>
-          <w:numId w:val="1029"/>
+          <w:numId w:val="1028"/>
         </w:numPr>
       </w:pPr>
       <w:r>
@@ -3300,7 +3227,7 @@
         <w:pStyle w:val="Compact"/>
         <w:numPr>
           <w:ilvl w:val="0"/>
-          <w:numId w:val="1029"/>
+          <w:numId w:val="1028"/>
         </w:numPr>
       </w:pPr>
       <w:r>
@@ -3325,8 +3252,8 @@
         <w:t xml:space="preserve">In institutional electronic trading, ISO codes dominate.</w:t>
       </w:r>
     </w:p>
-    <w:bookmarkEnd w:id="72"/>
-    <w:bookmarkStart w:id="73" w:name="X69188840c7cb1bcaadb26a64358754f1d3e7fcf"/>
+    <w:bookmarkEnd w:id="68"/>
+    <w:bookmarkStart w:id="69" w:name="X69188840c7cb1bcaadb26a64358754f1d3e7fcf"/>
     <w:p>
       <w:pPr>
         <w:pStyle w:val="Heading3"/>
@@ -3398,6 +3325,226 @@
         <w:pStyle w:val="Compact"/>
         <w:numPr>
           <w:ilvl w:val="0"/>
+          <w:numId w:val="1029"/>
+        </w:numPr>
+      </w:pPr>
+      <w:r>
+        <w:rPr>
+          <w:b/>
+          <w:bCs/>
+        </w:rPr>
+        <w:t xml:space="preserve">Base (unit) currency</w:t>
+      </w:r>
+      <w:r>
+        <w:t xml:space="preserve">: CUR_1 (the</w:t>
+      </w:r>
+      <w:r>
+        <w:t xml:space="preserve"> </w:t>
+      </w:r>
+      <w:r>
+        <w:t xml:space="preserve">“1 unit”</w:t>
+      </w:r>
+      <w:r>
+        <w:t xml:space="preserve"> </w:t>
+      </w:r>
+      <w:r>
+        <w:t xml:space="preserve">currency)</w:t>
+      </w:r>
+    </w:p>
+    <w:p>
+      <w:pPr>
+        <w:pStyle w:val="Compact"/>
+        <w:numPr>
+          <w:ilvl w:val="0"/>
+          <w:numId w:val="1029"/>
+        </w:numPr>
+      </w:pPr>
+      <w:r>
+        <w:rPr>
+          <w:b/>
+          <w:bCs/>
+        </w:rPr>
+        <w:t xml:space="preserve">Quote (price) currency</w:t>
+      </w:r>
+      <w:r>
+        <w:t xml:space="preserve">: CUR_2 (how many units you pay to get 1 unit of base)</w:t>
+      </w:r>
+    </w:p>
+    <w:p>
+      <w:pPr>
+        <w:pStyle w:val="FirstParagraph"/>
+      </w:pPr>
+      <w:r>
+        <w:t xml:space="preserve">Example:</w:t>
+      </w:r>
+      <w:r>
+        <w:t xml:space="preserve"> </w:t>
+      </w:r>
+      <w:r>
+        <w:rPr>
+          <w:b/>
+          <w:bCs/>
+        </w:rPr>
+        <w:t xml:space="preserve">EUR/USD 1.2174</w:t>
+      </w:r>
+      <w:r>
+        <w:t xml:space="preserve"> </w:t>
+      </w:r>
+      <w:r>
+        <w:t xml:space="preserve">means 1 euro costs 1.2174 dollars.</w:t>
+      </w:r>
+    </w:p>
+    <w:bookmarkEnd w:id="69"/>
+    <w:bookmarkStart w:id="75" w:name="market-conventions"/>
+    <w:p>
+      <w:pPr>
+        <w:pStyle w:val="Heading3"/>
+      </w:pPr>
+      <w:r>
+        <w:t xml:space="preserve">5.4.3 Market conventions</w:t>
+      </w:r>
+    </w:p>
+    <w:p>
+      <w:pPr>
+        <w:pStyle w:val="FirstParagraph"/>
+      </w:pPr>
+      <w:r>
+        <w:t xml:space="preserve">Different conventions can describe the same economic price.</w:t>
+      </w:r>
+    </w:p>
+    <w:bookmarkStart w:id="70" w:name="european-terms"/>
+    <w:p>
+      <w:pPr>
+        <w:pStyle w:val="Heading4"/>
+      </w:pPr>
+      <w:r>
+        <w:t xml:space="preserve">5.4.3.1 European terms</w:t>
+      </w:r>
+    </w:p>
+    <w:p>
+      <w:pPr>
+        <w:pStyle w:val="FirstParagraph"/>
+      </w:pPr>
+      <w:r>
+        <w:t xml:space="preserve">“Foreign currency per 1 USD”</w:t>
+      </w:r>
+      <w:r>
+        <w:t xml:space="preserve"> </w:t>
+      </w:r>
+      <w:r>
+        <w:t xml:space="preserve">(USD is the base).</w:t>
+      </w:r>
+      <w:r>
+        <w:br/>
+      </w:r>
+      <w:r>
+        <w:t xml:space="preserve">Example: USD/JPY 130.00 means USD 1 = JPY 130.</w:t>
+      </w:r>
+    </w:p>
+    <w:bookmarkEnd w:id="70"/>
+    <w:bookmarkStart w:id="71" w:name="american-terms"/>
+    <w:p>
+      <w:pPr>
+        <w:pStyle w:val="Heading4"/>
+      </w:pPr>
+      <w:r>
+        <w:t xml:space="preserve">5.4.3.2 American terms</w:t>
+      </w:r>
+    </w:p>
+    <w:p>
+      <w:pPr>
+        <w:pStyle w:val="FirstParagraph"/>
+      </w:pPr>
+      <w:r>
+        <w:t xml:space="preserve">“USD per 1 unit of foreign currency”</w:t>
+      </w:r>
+      <w:r>
+        <w:t xml:space="preserve"> </w:t>
+      </w:r>
+      <w:r>
+        <w:t xml:space="preserve">(USD is the quote).</w:t>
+      </w:r>
+      <w:r>
+        <w:br/>
+      </w:r>
+      <w:r>
+        <w:t xml:space="preserve">Example: EUR/USD 1.10 means EUR 1 = USD 1.10.</w:t>
+      </w:r>
+    </w:p>
+    <w:bookmarkEnd w:id="71"/>
+    <w:bookmarkStart w:id="72" w:name="currency-nicknames"/>
+    <w:p>
+      <w:pPr>
+        <w:pStyle w:val="Heading4"/>
+      </w:pPr>
+      <w:r>
+        <w:t xml:space="preserve">5.4.3.3 Currency nicknames</w:t>
+      </w:r>
+    </w:p>
+    <w:p>
+      <w:pPr>
+        <w:pStyle w:val="FirstParagraph"/>
+      </w:pPr>
+      <w:r>
+        <w:t xml:space="preserve">You will see informal terms in markets and news (e.g.,</w:t>
+      </w:r>
+      <w:r>
+        <w:t xml:space="preserve"> </w:t>
+      </w:r>
+      <w:r>
+        <w:t xml:space="preserve">“cable”</w:t>
+      </w:r>
+      <w:r>
+        <w:t xml:space="preserve"> </w:t>
+      </w:r>
+      <w:r>
+        <w:t xml:space="preserve">for GBP/USD,</w:t>
+      </w:r>
+      <w:r>
+        <w:t xml:space="preserve"> </w:t>
+      </w:r>
+      <w:r>
+        <w:t xml:space="preserve">“kiwi”</w:t>
+      </w:r>
+      <w:r>
+        <w:t xml:space="preserve"> </w:t>
+      </w:r>
+      <w:r>
+        <w:t xml:space="preserve">for NZD). The key is to translate the nickname back to a base/quote pair.</w:t>
+      </w:r>
+    </w:p>
+    <w:bookmarkEnd w:id="72"/>
+    <w:bookmarkStart w:id="73" w:name="direct-and-indirect-quotations"/>
+    <w:p>
+      <w:pPr>
+        <w:pStyle w:val="Heading4"/>
+      </w:pPr>
+      <w:r>
+        <w:t xml:space="preserve">5.4.3.4 Direct and indirect quotations</w:t>
+      </w:r>
+    </w:p>
+    <w:p>
+      <w:pPr>
+        <w:pStyle w:val="FirstParagraph"/>
+      </w:pPr>
+      <w:r>
+        <w:t xml:space="preserve">These depend on who is</w:t>
+      </w:r>
+      <w:r>
+        <w:t xml:space="preserve"> </w:t>
+      </w:r>
+      <w:r>
+        <w:t xml:space="preserve">“home”</w:t>
+      </w:r>
+      <w:r>
+        <w:t xml:space="preserve">:</w:t>
+      </w:r>
+    </w:p>
+    <w:p>
+      <w:pPr>
+        <w:pStyle w:val="Compact"/>
+        <w:numPr>
+          <w:ilvl w:val="0"/>
           <w:numId w:val="1030"/>
         </w:numPr>
       </w:pPr>
@@ -3406,22 +3553,10 @@
           <w:b/>
           <w:bCs/>
         </w:rPr>
-        <w:t xml:space="preserve">Base (unit) currency</w:t>
-      </w:r>
-      <w:r>
-        <w:t xml:space="preserve">: CUR_1 (the</w:t>
-      </w:r>
-      <w:r>
-        <w:t xml:space="preserve"> </w:t>
-      </w:r>
-      <w:r>
-        <w:t xml:space="preserve">“1 unit”</w:t>
-      </w:r>
-      <w:r>
-        <w:t xml:space="preserve"> </w:t>
-      </w:r>
-      <w:r>
-        <w:t xml:space="preserve">currency)</w:t>
+        <w:t xml:space="preserve">Direct quote</w:t>
+      </w:r>
+      <w:r>
+        <w:t xml:space="preserve">: home currency price of 1 unit of foreign currency.</w:t>
       </w:r>
     </w:p>
     <w:p>
@@ -3437,10 +3572,10 @@
           <w:b/>
           <w:bCs/>
         </w:rPr>
-        <w:t xml:space="preserve">Quote (price) currency</w:t>
-      </w:r>
-      <w:r>
-        <w:t xml:space="preserve">: CUR_2 (how many units you pay to get 1 unit of base)</w:t>
+        <w:t xml:space="preserve">Indirect quote</w:t>
+      </w:r>
+      <w:r>
+        <w:t xml:space="preserve">: foreign currency price of 1 unit of home currency.</w:t>
       </w:r>
     </w:p>
     <w:p>
@@ -3448,33 +3583,79 @@
         <w:pStyle w:val="FirstParagraph"/>
       </w:pPr>
       <w:r>
-        <w:t xml:space="preserve">Example:</w:t>
-      </w:r>
-      <w:r>
-        <w:t xml:space="preserve"> </w:t>
-      </w:r>
-      <w:r>
-        <w:rPr>
-          <w:b/>
-          <w:bCs/>
-        </w:rPr>
-        <w:t xml:space="preserve">EUR/USD 1.2174</w:t>
-      </w:r>
-      <w:r>
-        <w:t xml:space="preserve"> </w:t>
-      </w:r>
-      <w:r>
-        <w:t xml:space="preserve">means 1 euro costs 1.2174 dollars.</w:t>
+        <w:t xml:space="preserve">For a U.S. resident,</w:t>
+      </w:r>
+      <w:r>
+        <w:t xml:space="preserve"> </w:t>
+      </w:r>
+      <m:oMath>
+        <m:r>
+          <m:rPr>
+            <m:nor/>
+            <m:sty m:val="p"/>
+          </m:rPr>
+          <m:t>USD</m:t>
+        </m:r>
+        <m:r>
+          <m:rPr>
+            <m:sty m:val="p"/>
+          </m:rPr>
+          <m:t>/</m:t>
+        </m:r>
+        <m:r>
+          <m:rPr>
+            <m:nor/>
+            <m:sty m:val="p"/>
+          </m:rPr>
+          <m:t>EUR</m:t>
+        </m:r>
+      </m:oMath>
+      <w:r>
+        <w:t xml:space="preserve"> </w:t>
+      </w:r>
+      <w:r>
+        <w:t xml:space="preserve">is direct;</w:t>
+      </w:r>
+      <w:r>
+        <w:t xml:space="preserve"> </w:t>
+      </w:r>
+      <m:oMath>
+        <m:r>
+          <m:rPr>
+            <m:nor/>
+            <m:sty m:val="p"/>
+          </m:rPr>
+          <m:t>EUR</m:t>
+        </m:r>
+        <m:r>
+          <m:rPr>
+            <m:sty m:val="p"/>
+          </m:rPr>
+          <m:t>/</m:t>
+        </m:r>
+        <m:r>
+          <m:rPr>
+            <m:nor/>
+            <m:sty m:val="p"/>
+          </m:rPr>
+          <m:t>USD</m:t>
+        </m:r>
+      </m:oMath>
+      <w:r>
+        <w:t xml:space="preserve"> </w:t>
+      </w:r>
+      <w:r>
+        <w:t xml:space="preserve">is indirect.</w:t>
       </w:r>
     </w:p>
     <w:bookmarkEnd w:id="73"/>
-    <w:bookmarkStart w:id="85" w:name="market-conventions"/>
-    <w:p>
-      <w:pPr>
-        <w:pStyle w:val="Heading3"/>
-      </w:pPr>
-      <w:r>
-        <w:t xml:space="preserve">5.4.3 Market conventions</w:t>
+    <w:bookmarkStart w:id="74" w:name="bid-and-ask-rates"/>
+    <w:p>
+      <w:pPr>
+        <w:pStyle w:val="Heading4"/>
+      </w:pPr>
+      <w:r>
+        <w:t xml:space="preserve">5.4.3.5 Bid and ask rates</w:t>
       </w:r>
     </w:p>
     <w:p>
@@ -3482,16 +3663,45 @@
         <w:pStyle w:val="FirstParagraph"/>
       </w:pPr>
       <w:r>
-        <w:t xml:space="preserve">Different conventions can describe the same economic price.</w:t>
-      </w:r>
-    </w:p>
-    <w:bookmarkStart w:id="74" w:name="european-terms"/>
-    <w:p>
-      <w:pPr>
-        <w:pStyle w:val="Heading4"/>
-      </w:pPr>
-      <w:r>
-        <w:t xml:space="preserve">5.4.3.1 European terms</w:t>
+        <w:t xml:space="preserve">Interbank quotes are two-sided:</w:t>
+      </w:r>
+    </w:p>
+    <w:p>
+      <w:pPr>
+        <w:pStyle w:val="Compact"/>
+        <w:numPr>
+          <w:ilvl w:val="0"/>
+          <w:numId w:val="1031"/>
+        </w:numPr>
+      </w:pPr>
+      <w:r>
+        <w:rPr>
+          <w:b/>
+          <w:bCs/>
+        </w:rPr>
+        <w:t xml:space="preserve">Bid</w:t>
+      </w:r>
+      <w:r>
+        <w:t xml:space="preserve">: dealer buys the base currency (you sell it to the dealer)</w:t>
+      </w:r>
+    </w:p>
+    <w:p>
+      <w:pPr>
+        <w:pStyle w:val="Compact"/>
+        <w:numPr>
+          <w:ilvl w:val="0"/>
+          <w:numId w:val="1031"/>
+        </w:numPr>
+      </w:pPr>
+      <w:r>
+        <w:rPr>
+          <w:b/>
+          <w:bCs/>
+        </w:rPr>
+        <w:t xml:space="preserve">Ask (offer)</w:t>
+      </w:r>
+      <w:r>
+        <w:t xml:space="preserve">: dealer sells the base currency (you buy it from the dealer)</w:t>
       </w:r>
     </w:p>
     <w:p>
@@ -3499,206 +3709,7 @@
         <w:pStyle w:val="FirstParagraph"/>
       </w:pPr>
       <w:r>
-        <w:t xml:space="preserve">“Foreign currency per 1 USD”</w:t>
-      </w:r>
-      <w:r>
-        <w:t xml:space="preserve"> </w:t>
-      </w:r>
-      <w:r>
-        <w:t xml:space="preserve">(USD is the base).</w:t>
-      </w:r>
-      <w:r>
-        <w:br/>
-      </w:r>
-      <w:r>
-        <w:t xml:space="preserve">Example: USD/JPY 130.00 means USD 1 = JPY 130.</w:t>
-      </w:r>
-    </w:p>
-    <w:bookmarkEnd w:id="74"/>
-    <w:bookmarkStart w:id="75" w:name="american-terms"/>
-    <w:p>
-      <w:pPr>
-        <w:pStyle w:val="Heading4"/>
-      </w:pPr>
-      <w:r>
-        <w:t xml:space="preserve">5.4.3.2 American terms</w:t>
-      </w:r>
-    </w:p>
-    <w:p>
-      <w:pPr>
-        <w:pStyle w:val="FirstParagraph"/>
-      </w:pPr>
-      <w:r>
-        <w:t xml:space="preserve">“USD per 1 unit of foreign currency”</w:t>
-      </w:r>
-      <w:r>
-        <w:t xml:space="preserve"> </w:t>
-      </w:r>
-      <w:r>
-        <w:t xml:space="preserve">(USD is the quote).</w:t>
-      </w:r>
-      <w:r>
-        <w:br/>
-      </w:r>
-      <w:r>
-        <w:t xml:space="preserve">Example: EUR/USD 1.10 means EUR 1 = USD 1.10.</w:t>
-      </w:r>
-    </w:p>
-    <w:bookmarkEnd w:id="75"/>
-    <w:bookmarkStart w:id="76" w:name="currency-nicknames"/>
-    <w:p>
-      <w:pPr>
-        <w:pStyle w:val="Heading4"/>
-      </w:pPr>
-      <w:r>
-        <w:t xml:space="preserve">5.4.3.3 Currency nicknames</w:t>
-      </w:r>
-    </w:p>
-    <w:p>
-      <w:pPr>
-        <w:pStyle w:val="FirstParagraph"/>
-      </w:pPr>
-      <w:r>
-        <w:t xml:space="preserve">You will see informal terms in markets and news (e.g.,</w:t>
-      </w:r>
-      <w:r>
-        <w:t xml:space="preserve"> </w:t>
-      </w:r>
-      <w:r>
-        <w:t xml:space="preserve">“cable”</w:t>
-      </w:r>
-      <w:r>
-        <w:t xml:space="preserve"> </w:t>
-      </w:r>
-      <w:r>
-        <w:t xml:space="preserve">for GBP/USD,</w:t>
-      </w:r>
-      <w:r>
-        <w:t xml:space="preserve"> </w:t>
-      </w:r>
-      <w:r>
-        <w:t xml:space="preserve">“kiwi”</w:t>
-      </w:r>
-      <w:r>
-        <w:t xml:space="preserve"> </w:t>
-      </w:r>
-      <w:r>
-        <w:t xml:space="preserve">for NZD). The key is to translate the nickname back to a base/quote pair.</w:t>
-      </w:r>
-    </w:p>
-    <w:bookmarkEnd w:id="76"/>
-    <w:bookmarkStart w:id="77" w:name="direct-and-indirect-quotations"/>
-    <w:p>
-      <w:pPr>
-        <w:pStyle w:val="Heading4"/>
-      </w:pPr>
-      <w:r>
-        <w:t xml:space="preserve">5.4.3.4 Direct and indirect quotations</w:t>
-      </w:r>
-    </w:p>
-    <w:p>
-      <w:pPr>
-        <w:pStyle w:val="FirstParagraph"/>
-      </w:pPr>
-      <w:r>
-        <w:t xml:space="preserve">These depend on who is</w:t>
-      </w:r>
-      <w:r>
-        <w:t xml:space="preserve"> </w:t>
-      </w:r>
-      <w:r>
-        <w:t xml:space="preserve">“home”</w:t>
-      </w:r>
-      <w:r>
-        <w:t xml:space="preserve">:</w:t>
-      </w:r>
-    </w:p>
-    <w:p>
-      <w:pPr>
-        <w:pStyle w:val="Compact"/>
-        <w:numPr>
-          <w:ilvl w:val="0"/>
-          <w:numId w:val="1031"/>
-        </w:numPr>
-      </w:pPr>
-      <w:r>
-        <w:rPr>
-          <w:b/>
-          <w:bCs/>
-        </w:rPr>
-        <w:t xml:space="preserve">Direct quote</w:t>
-      </w:r>
-      <w:r>
-        <w:t xml:space="preserve">: home currency price of 1 unit of foreign currency.</w:t>
-      </w:r>
-    </w:p>
-    <w:p>
-      <w:pPr>
-        <w:pStyle w:val="Compact"/>
-        <w:numPr>
-          <w:ilvl w:val="0"/>
-          <w:numId w:val="1031"/>
-        </w:numPr>
-      </w:pPr>
-      <w:r>
-        <w:rPr>
-          <w:b/>
-          <w:bCs/>
-        </w:rPr>
-        <w:t xml:space="preserve">Indirect quote</w:t>
-      </w:r>
-      <w:r>
-        <w:t xml:space="preserve">: foreign currency price of 1 unit of home currency.</w:t>
-      </w:r>
-    </w:p>
-    <w:p>
-      <w:pPr>
-        <w:pStyle w:val="FirstParagraph"/>
-      </w:pPr>
-      <w:r>
-        <w:t xml:space="preserve">For a U.S. resident,</w:t>
-      </w:r>
-      <w:r>
-        <w:t xml:space="preserve"> </w:t>
-      </w:r>
-      <w:r>
-        <w:t xml:space="preserve">/</w:t>
-      </w:r>
-      <w:r>
-        <w:t xml:space="preserve"> </w:t>
-      </w:r>
-      <w:r>
-        <w:t xml:space="preserve">is direct;</w:t>
-      </w:r>
-      <w:r>
-        <w:t xml:space="preserve"> </w:t>
-      </w:r>
-      <w:r>
-        <w:t xml:space="preserve">/</w:t>
-      </w:r>
-      <w:r>
-        <w:t xml:space="preserve"> </w:t>
-      </w:r>
-      <w:r>
-        <w:t xml:space="preserve">is indirect.</w:t>
-      </w:r>
-    </w:p>
-    <w:bookmarkEnd w:id="77"/>
-    <w:bookmarkStart w:id="84" w:name="bid-and-ask-rates"/>
-    <w:p>
-      <w:pPr>
-        <w:pStyle w:val="Heading4"/>
-      </w:pPr>
-      <w:r>
-        <w:t xml:space="preserve">5.4.3.5 Bid and ask rates</w:t>
-      </w:r>
-    </w:p>
-    <w:p>
-      <w:pPr>
-        <w:pStyle w:val="FirstParagraph"/>
-      </w:pPr>
-      <w:r>
-        <w:t xml:space="preserve">Interbank quotes are two-sided:</w:t>
+        <w:t xml:space="preserve">A useful operational rule:</w:t>
       </w:r>
     </w:p>
     <w:p>
@@ -3707,107 +3718,6 @@
         <w:numPr>
           <w:ilvl w:val="0"/>
           <w:numId w:val="1032"/>
-        </w:numPr>
-      </w:pPr>
-      <w:r>
-        <w:rPr>
-          <w:b/>
-          <w:bCs/>
-        </w:rPr>
-        <w:t xml:space="preserve">Bid</w:t>
-      </w:r>
-      <w:r>
-        <w:t xml:space="preserve">: dealer buys the base currency (you sell it to the dealer)</w:t>
-      </w:r>
-    </w:p>
-    <w:p>
-      <w:pPr>
-        <w:pStyle w:val="Compact"/>
-        <w:numPr>
-          <w:ilvl w:val="0"/>
-          <w:numId w:val="1032"/>
-        </w:numPr>
-      </w:pPr>
-      <w:r>
-        <w:rPr>
-          <w:b/>
-          <w:bCs/>
-        </w:rPr>
-        <w:t xml:space="preserve">Ask (offer)</w:t>
-      </w:r>
-      <w:r>
-        <w:t xml:space="preserve">: dealer sells the base currency (you buy it from the dealer)</w:t>
-      </w:r>
-    </w:p>
-    <w:p>
-      <w:pPr>
-        <w:pStyle w:val="CaptionedFigure"/>
-      </w:pPr>
-      <w:r>
-        <w:drawing>
-          <wp:inline>
-            <wp:extent cx="4267200" cy="3200399"/>
-            <wp:effectExtent b="0" l="0" r="0" t="0"/>
-            <wp:docPr descr="Bid, Ask, and Mid-Point Quotation" title="" id="79" name="Picture"/>
-            <a:graphic>
-              <a:graphicData uri="http://schemas.openxmlformats.org/drawingml/2006/picture">
-                <pic:pic>
-                  <pic:nvPicPr>
-                    <pic:cNvPr descr="../assets/images/Ch05/Exhibit_5.10_bid_ask_midpoint.png" id="80" name="Picture"/>
-                    <pic:cNvPicPr>
-                      <a:picLocks noChangeArrowheads="1" noChangeAspect="1"/>
-                    </pic:cNvPicPr>
-                  </pic:nvPicPr>
-                  <pic:blipFill>
-                    <a:blip r:embed="rId78"/>
-                    <a:stretch>
-                      <a:fillRect/>
-                    </a:stretch>
-                  </pic:blipFill>
-                  <pic:spPr bwMode="auto">
-                    <a:xfrm>
-                      <a:off x="0" y="0"/>
-                      <a:ext cx="4267200" cy="3200399"/>
-                    </a:xfrm>
-                    <a:prstGeom prst="rect">
-                      <a:avLst/>
-                    </a:prstGeom>
-                    <a:noFill/>
-                    <a:ln w="9525">
-                      <a:noFill/>
-                      <a:headEnd/>
-                      <a:tailEnd/>
-                    </a:ln>
-                  </pic:spPr>
-                </pic:pic>
-              </a:graphicData>
-            </a:graphic>
-          </wp:inline>
-        </w:drawing>
-      </w:r>
-    </w:p>
-    <w:p>
-      <w:pPr>
-        <w:pStyle w:val="ImageCaption"/>
-      </w:pPr>
-      <w:r>
-        <w:t xml:space="preserve">Bid, Ask, and Mid-Point Quotation</w:t>
-      </w:r>
-    </w:p>
-    <w:p>
-      <w:pPr>
-        <w:pStyle w:val="BodyText"/>
-      </w:pPr>
-      <w:r>
-        <w:t xml:space="preserve">A useful operational rule:</w:t>
-      </w:r>
-    </w:p>
-    <w:p>
-      <w:pPr>
-        <w:pStyle w:val="Compact"/>
-        <w:numPr>
-          <w:ilvl w:val="0"/>
-          <w:numId w:val="1033"/>
         </w:numPr>
       </w:pPr>
       <w:r>
@@ -3820,57 +3730,39 @@
     </w:p>
     <w:p>
       <w:pPr>
-        <w:pStyle w:val="CaptionedFigure"/>
-      </w:pPr>
-      <w:r>
-        <w:drawing>
-          <wp:inline>
-            <wp:extent cx="4800600" cy="3600450"/>
-            <wp:effectExtent b="0" l="0" r="0" t="0"/>
-            <wp:docPr descr="Exchange Rates: New York Closing Snapshot" title="" id="82" name="Picture"/>
-            <a:graphic>
-              <a:graphicData uri="http://schemas.openxmlformats.org/drawingml/2006/picture">
-                <pic:pic>
-                  <pic:nvPicPr>
-                    <pic:cNvPr descr="../assets/images/Ch05/Exhibit_5.11_WSJ_closing_snapshot.png" id="83" name="Picture"/>
-                    <pic:cNvPicPr>
-                      <a:picLocks noChangeArrowheads="1" noChangeAspect="1"/>
-                    </pic:cNvPicPr>
-                  </pic:nvPicPr>
-                  <pic:blipFill>
-                    <a:blip r:embed="rId81"/>
-                    <a:stretch>
-                      <a:fillRect/>
-                    </a:stretch>
-                  </pic:blipFill>
-                  <pic:spPr bwMode="auto">
-                    <a:xfrm>
-                      <a:off x="0" y="0"/>
-                      <a:ext cx="4800600" cy="3600450"/>
-                    </a:xfrm>
-                    <a:prstGeom prst="rect">
-                      <a:avLst/>
-                    </a:prstGeom>
-                    <a:noFill/>
-                    <a:ln w="9525">
-                      <a:noFill/>
-                      <a:headEnd/>
-                      <a:tailEnd/>
-                    </a:ln>
-                  </pic:spPr>
-                </pic:pic>
-              </a:graphicData>
-            </a:graphic>
-          </wp:inline>
-        </w:drawing>
-      </w:r>
-    </w:p>
-    <w:p>
-      <w:pPr>
-        <w:pStyle w:val="ImageCaption"/>
-      </w:pPr>
-      <w:r>
-        <w:t xml:space="preserve">Exchange Rates: New York Closing Snapshot</w:t>
+        <w:pStyle w:val="FirstParagraph"/>
+      </w:pPr>
+      <w:r>
+        <w:rPr>
+          <w:b/>
+          <w:bCs/>
+        </w:rPr>
+        <w:t xml:space="preserve">Why do spreads exist?</w:t>
+      </w:r>
+      <w:r>
+        <w:t xml:space="preserve"> </w:t>
+      </w:r>
+      <w:r>
+        <w:t xml:space="preserve">processing costs, inventory costs, volatility, and market competition/liquidity.</w:t>
+      </w:r>
+    </w:p>
+    <w:bookmarkEnd w:id="74"/>
+    <w:bookmarkEnd w:id="75"/>
+    <w:bookmarkStart w:id="76" w:name="cross-rates"/>
+    <w:p>
+      <w:pPr>
+        <w:pStyle w:val="Heading3"/>
+      </w:pPr>
+      <w:r>
+        <w:t xml:space="preserve">5.4.4 Cross rates</w:t>
+      </w:r>
+    </w:p>
+    <w:p>
+      <w:pPr>
+        <w:pStyle w:val="FirstParagraph"/>
+      </w:pPr>
+      <w:r>
+        <w:t xml:space="preserve">Many currency pairs are thinly traded. Their rate is often implied via a third currency (commonly USD).</w:t>
       </w:r>
     </w:p>
     <w:p>
@@ -3878,36 +3770,7 @@
         <w:pStyle w:val="BodyText"/>
       </w:pPr>
       <w:r>
-        <w:rPr>
-          <w:b/>
-          <w:bCs/>
-        </w:rPr>
-        <w:t xml:space="preserve">Why do spreads exist?</w:t>
-      </w:r>
-      <w:r>
-        <w:t xml:space="preserve"> </w:t>
-      </w:r>
-      <w:r>
-        <w:t xml:space="preserve">processing costs, inventory costs, volatility, and market competition/liquidity.</w:t>
-      </w:r>
-    </w:p>
-    <w:bookmarkEnd w:id="84"/>
-    <w:bookmarkEnd w:id="85"/>
-    <w:bookmarkStart w:id="86" w:name="cross-rates"/>
-    <w:p>
-      <w:pPr>
-        <w:pStyle w:val="Heading3"/>
-      </w:pPr>
-      <w:r>
-        <w:t xml:space="preserve">5.4.4 Cross rates</w:t>
-      </w:r>
-    </w:p>
-    <w:p>
-      <w:pPr>
-        <w:pStyle w:val="FirstParagraph"/>
-      </w:pPr>
-      <w:r>
-        <w:t xml:space="preserve">Many currency pairs are thinly traded. Their rate is often implied via a third currency (commonly USD).</w:t>
+        <w:t xml:space="preserve">Example logic:</w:t>
       </w:r>
     </w:p>
     <w:p>
@@ -3915,22 +3778,33 @@
         <w:pStyle w:val="BodyText"/>
       </w:pPr>
       <w:r>
-        <w:t xml:space="preserve">Example logic:</w:t>
-      </w:r>
-    </w:p>
-    <w:p>
-      <w:pPr>
-        <w:pStyle w:val="BodyText"/>
-      </w:pPr>
-      <w:r>
         <w:t xml:space="preserve">If you know</w:t>
       </w:r>
       <w:r>
         <w:t xml:space="preserve"> </w:t>
       </w:r>
-      <w:r>
-        <w:t xml:space="preserve">/</w:t>
-      </w:r>
+      <m:oMath>
+        <m:r>
+          <m:rPr>
+            <m:nor/>
+            <m:sty m:val="p"/>
+          </m:rPr>
+          <m:t>USD</m:t>
+        </m:r>
+        <m:r>
+          <m:rPr>
+            <m:sty m:val="p"/>
+          </m:rPr>
+          <m:t>/</m:t>
+        </m:r>
+        <m:r>
+          <m:rPr>
+            <m:nor/>
+            <m:sty m:val="p"/>
+          </m:rPr>
+          <m:t>EUR</m:t>
+        </m:r>
+      </m:oMath>
       <w:r>
         <w:t xml:space="preserve"> </w:t>
       </w:r>
@@ -3940,9 +3814,28 @@
       <w:r>
         <w:t xml:space="preserve"> </w:t>
       </w:r>
-      <w:r>
-        <w:t xml:space="preserve">/</w:t>
-      </w:r>
+      <m:oMath>
+        <m:r>
+          <m:rPr>
+            <m:nor/>
+            <m:sty m:val="p"/>
+          </m:rPr>
+          <m:t>USD</m:t>
+        </m:r>
+        <m:r>
+          <m:rPr>
+            <m:sty m:val="p"/>
+          </m:rPr>
+          <m:t>/</m:t>
+        </m:r>
+        <m:r>
+          <m:rPr>
+            <m:nor/>
+            <m:sty m:val="p"/>
+          </m:rPr>
+          <m:t>GBP</m:t>
+        </m:r>
+      </m:oMath>
       <w:r>
         <w:t xml:space="preserve">, then</w:t>
       </w:r>
@@ -4042,8 +3935,8 @@
         <w:t xml:space="preserve">(Keep track of units like you would in dimensional analysis.)</w:t>
       </w:r>
     </w:p>
-    <w:bookmarkEnd w:id="86"/>
-    <w:bookmarkStart w:id="90" w:name="intermarket-triangular-arbitrage"/>
+    <w:bookmarkEnd w:id="76"/>
+    <w:bookmarkStart w:id="80" w:name="intermarket-triangular-arbitrage"/>
     <w:p>
       <w:pPr>
         <w:pStyle w:val="Heading3"/>
@@ -4069,18 +3962,18 @@
           <wp:inline>
             <wp:extent cx="4800600" cy="3600450"/>
             <wp:effectExtent b="0" l="0" r="0" t="0"/>
-            <wp:docPr descr="Triangular Arbitrage by a Market Trader" title="" id="88" name="Picture"/>
+            <wp:docPr descr="Triangular Arbitrage by a Market Trader" title="" id="78" name="Picture"/>
             <a:graphic>
               <a:graphicData uri="http://schemas.openxmlformats.org/drawingml/2006/picture">
                 <pic:pic>
                   <pic:nvPicPr>
-                    <pic:cNvPr descr="../assets/images/Ch05/Exhibit_5.12_triangular_arbitrage.png" id="89" name="Picture"/>
+                    <pic:cNvPr descr="../assets/images/Ch05/Exhibit_5.12_triangular_arbitrage.png" id="79" name="Picture"/>
                     <pic:cNvPicPr>
                       <a:picLocks noChangeArrowheads="1" noChangeAspect="1"/>
                     </pic:cNvPicPr>
                   </pic:nvPicPr>
                   <pic:blipFill>
-                    <a:blip r:embed="rId87"/>
+                    <a:blip r:embed="rId77"/>
                     <a:stretch>
                       <a:fillRect/>
                     </a:stretch>
@@ -4120,7 +4013,101 @@
         <w:pStyle w:val="BodyText"/>
       </w:pPr>
       <w:r>
-        <w:t xml:space="preserve">A safe teaching sequence:</w:t>
+        <w:t xml:space="preserve">An example of Arbitrage:</w:t>
+      </w:r>
+    </w:p>
+    <w:p>
+      <w:pPr>
+        <w:pStyle w:val="Compact"/>
+        <w:numPr>
+          <w:ilvl w:val="0"/>
+          <w:numId w:val="1033"/>
+        </w:numPr>
+      </w:pPr>
+      <w:r>
+        <w:t xml:space="preserve">Start with one currency (e.g., USD).</w:t>
+      </w:r>
+    </w:p>
+    <w:p>
+      <w:pPr>
+        <w:pStyle w:val="Compact"/>
+        <w:numPr>
+          <w:ilvl w:val="0"/>
+          <w:numId w:val="1033"/>
+        </w:numPr>
+      </w:pPr>
+      <w:r>
+        <w:t xml:space="preserve">Convert to a second currency at the dealer’s bid/ask.</w:t>
+      </w:r>
+    </w:p>
+    <w:p>
+      <w:pPr>
+        <w:pStyle w:val="Compact"/>
+        <w:numPr>
+          <w:ilvl w:val="0"/>
+          <w:numId w:val="1033"/>
+        </w:numPr>
+      </w:pPr>
+      <w:r>
+        <w:t xml:space="preserve">Convert to a third currency.</w:t>
+      </w:r>
+    </w:p>
+    <w:p>
+      <w:pPr>
+        <w:pStyle w:val="Compact"/>
+        <w:numPr>
+          <w:ilvl w:val="0"/>
+          <w:numId w:val="1033"/>
+        </w:numPr>
+      </w:pPr>
+      <w:r>
+        <w:t xml:space="preserve">Convert back to the original.</w:t>
+      </w:r>
+    </w:p>
+    <w:p>
+      <w:pPr>
+        <w:pStyle w:val="Compact"/>
+        <w:numPr>
+          <w:ilvl w:val="0"/>
+          <w:numId w:val="1033"/>
+        </w:numPr>
+      </w:pPr>
+      <w:r>
+        <w:t xml:space="preserve">If you end with more than you started (after costs), an arbitrage exists.</w:t>
+      </w:r>
+    </w:p>
+    <w:bookmarkEnd w:id="80"/>
+    <w:bookmarkStart w:id="85" w:name="forward-quotations"/>
+    <w:p>
+      <w:pPr>
+        <w:pStyle w:val="Heading3"/>
+      </w:pPr>
+      <w:r>
+        <w:t xml:space="preserve">5.4.6 Forward quotations</w:t>
+      </w:r>
+    </w:p>
+    <w:p>
+      <w:pPr>
+        <w:pStyle w:val="FirstParagraph"/>
+      </w:pPr>
+      <w:r>
+        <w:t xml:space="preserve">Forward rates are often quoted as</w:t>
+      </w:r>
+      <w:r>
+        <w:t xml:space="preserve"> </w:t>
+      </w:r>
+      <w:r>
+        <w:rPr>
+          <w:b/>
+          <w:bCs/>
+        </w:rPr>
+        <w:t xml:space="preserve">forward points</w:t>
+      </w:r>
+      <w:r>
+        <w:t xml:space="preserve"> </w:t>
+      </w:r>
+      <w:r>
+        <w:t xml:space="preserve">(or pips) relative to spot.</w:t>
       </w:r>
     </w:p>
     <w:p>
@@ -4132,7 +4119,19 @@
         </w:numPr>
       </w:pPr>
       <w:r>
-        <w:t xml:space="preserve">Start with one currency (e.g., USD).</w:t>
+        <w:t xml:space="preserve">Spot is quoted</w:t>
+      </w:r>
+      <w:r>
+        <w:t xml:space="preserve"> </w:t>
+      </w:r>
+      <w:r>
+        <w:t xml:space="preserve">“outright”</w:t>
+      </w:r>
+      <w:r>
+        <w:t xml:space="preserve"> </w:t>
+      </w:r>
+      <w:r>
+        <w:t xml:space="preserve">(all digits).</w:t>
       </w:r>
     </w:p>
     <w:p>
@@ -4141,112 +4140,6 @@
         <w:numPr>
           <w:ilvl w:val="0"/>
           <w:numId w:val="1034"/>
-        </w:numPr>
-      </w:pPr>
-      <w:r>
-        <w:t xml:space="preserve">Convert to a second currency at the dealer’s bid/ask.</w:t>
-      </w:r>
-    </w:p>
-    <w:p>
-      <w:pPr>
-        <w:pStyle w:val="Compact"/>
-        <w:numPr>
-          <w:ilvl w:val="0"/>
-          <w:numId w:val="1034"/>
-        </w:numPr>
-      </w:pPr>
-      <w:r>
-        <w:t xml:space="preserve">Convert to a third currency.</w:t>
-      </w:r>
-    </w:p>
-    <w:p>
-      <w:pPr>
-        <w:pStyle w:val="Compact"/>
-        <w:numPr>
-          <w:ilvl w:val="0"/>
-          <w:numId w:val="1034"/>
-        </w:numPr>
-      </w:pPr>
-      <w:r>
-        <w:t xml:space="preserve">Convert back to the original.</w:t>
-      </w:r>
-    </w:p>
-    <w:p>
-      <w:pPr>
-        <w:pStyle w:val="Compact"/>
-        <w:numPr>
-          <w:ilvl w:val="0"/>
-          <w:numId w:val="1034"/>
-        </w:numPr>
-      </w:pPr>
-      <w:r>
-        <w:t xml:space="preserve">If you end with more than you started (after costs), an arbitrage exists.</w:t>
-      </w:r>
-    </w:p>
-    <w:bookmarkEnd w:id="90"/>
-    <w:bookmarkStart w:id="95" w:name="forward-quotations"/>
-    <w:p>
-      <w:pPr>
-        <w:pStyle w:val="Heading3"/>
-      </w:pPr>
-      <w:r>
-        <w:t xml:space="preserve">5.4.6 Forward quotations</w:t>
-      </w:r>
-    </w:p>
-    <w:p>
-      <w:pPr>
-        <w:pStyle w:val="FirstParagraph"/>
-      </w:pPr>
-      <w:r>
-        <w:t xml:space="preserve">Forward rates are often quoted as</w:t>
-      </w:r>
-      <w:r>
-        <w:t xml:space="preserve"> </w:t>
-      </w:r>
-      <w:r>
-        <w:rPr>
-          <w:b/>
-          <w:bCs/>
-        </w:rPr>
-        <w:t xml:space="preserve">forward points</w:t>
-      </w:r>
-      <w:r>
-        <w:t xml:space="preserve"> </w:t>
-      </w:r>
-      <w:r>
-        <w:t xml:space="preserve">(or pips) relative to spot.</w:t>
-      </w:r>
-    </w:p>
-    <w:p>
-      <w:pPr>
-        <w:pStyle w:val="Compact"/>
-        <w:numPr>
-          <w:ilvl w:val="0"/>
-          <w:numId w:val="1035"/>
-        </w:numPr>
-      </w:pPr>
-      <w:r>
-        <w:t xml:space="preserve">Spot is quoted</w:t>
-      </w:r>
-      <w:r>
-        <w:t xml:space="preserve"> </w:t>
-      </w:r>
-      <w:r>
-        <w:t xml:space="preserve">“outright”</w:t>
-      </w:r>
-      <w:r>
-        <w:t xml:space="preserve"> </w:t>
-      </w:r>
-      <w:r>
-        <w:t xml:space="preserve">(all digits).</w:t>
-      </w:r>
-    </w:p>
-    <w:p>
-      <w:pPr>
-        <w:pStyle w:val="Compact"/>
-        <w:numPr>
-          <w:ilvl w:val="0"/>
-          <w:numId w:val="1035"/>
         </w:numPr>
       </w:pPr>
       <w:r>
@@ -4278,18 +4171,18 @@
           <wp:inline>
             <wp:extent cx="4800600" cy="3600450"/>
             <wp:effectExtent b="0" l="0" r="0" t="0"/>
-            <wp:docPr descr="Spot and Forward Quotations for the Euro and Japanese Yen" title="" id="92" name="Picture"/>
+            <wp:docPr descr="Spot and Forward Quotations for the Euro and Japanese Yen" title="" id="82" name="Picture"/>
             <a:graphic>
               <a:graphicData uri="http://schemas.openxmlformats.org/drawingml/2006/picture">
                 <pic:pic>
                   <pic:nvPicPr>
-                    <pic:cNvPr descr="../assets/images/Ch05/Exhibit_5.13_spot_forward_quotes.png" id="93" name="Picture"/>
+                    <pic:cNvPr descr="../assets/images/Ch05/Exhibit_5.13_spot_forward_quotes.png" id="83" name="Picture"/>
                     <pic:cNvPicPr>
                       <a:picLocks noChangeArrowheads="1" noChangeAspect="1"/>
                     </pic:cNvPicPr>
                   </pic:nvPicPr>
                   <pic:blipFill>
-                    <a:blip r:embed="rId91"/>
+                    <a:blip r:embed="rId81"/>
                     <a:stretch>
                       <a:fillRect/>
                     </a:stretch>
@@ -4324,7 +4217,7 @@
         <w:t xml:space="preserve">Spot and Forward Quotations for the Euro and Japanese Yen</w:t>
       </w:r>
     </w:p>
-    <w:bookmarkStart w:id="94" w:name="forward-premiumdiscount-annualized"/>
+    <w:bookmarkStart w:id="84" w:name="forward-premiumdiscount-annualized"/>
     <w:p>
       <w:pPr>
         <w:pStyle w:val="Heading4"/>
@@ -4426,27 +4319,115 @@
         <w:pStyle w:val="Compact"/>
         <w:numPr>
           <w:ilvl w:val="0"/>
+          <w:numId w:val="1035"/>
+        </w:numPr>
+      </w:pPr>
+      <w:r>
+        <w:t xml:space="preserve">If (F &gt; S): the foreign currency is at a</w:t>
+      </w:r>
+      <w:r>
+        <w:t xml:space="preserve"> </w:t>
+      </w:r>
+      <w:r>
+        <w:rPr>
+          <w:b/>
+          <w:bCs/>
+        </w:rPr>
+        <w:t xml:space="preserve">forward premium</w:t>
+      </w:r>
+      <w:r>
+        <w:t xml:space="preserve"> </w:t>
+      </w:r>
+      <w:r>
+        <w:t xml:space="preserve">(in American terms).</w:t>
+      </w:r>
+    </w:p>
+    <w:p>
+      <w:pPr>
+        <w:pStyle w:val="Compact"/>
+        <w:numPr>
+          <w:ilvl w:val="0"/>
+          <w:numId w:val="1035"/>
+        </w:numPr>
+      </w:pPr>
+      <w:r>
+        <w:t xml:space="preserve">If (F &lt; S): it is at a</w:t>
+      </w:r>
+      <w:r>
+        <w:t xml:space="preserve"> </w:t>
+      </w:r>
+      <w:r>
+        <w:rPr>
+          <w:b/>
+          <w:bCs/>
+        </w:rPr>
+        <w:t xml:space="preserve">forward discount</w:t>
+      </w:r>
+      <w:r>
+        <w:t xml:space="preserve">.</w:t>
+      </w:r>
+    </w:p>
+    <w:p>
+      <w:pPr>
+        <w:pStyle w:val="FirstParagraph"/>
+      </w:pPr>
+      <w:r>
+        <w:rPr>
+          <w:b/>
+          <w:bCs/>
+        </w:rPr>
+        <w:t xml:space="preserve">Important note:</w:t>
+      </w:r>
+      <w:r>
+        <w:t xml:space="preserve"> </w:t>
+      </w:r>
+      <w:r>
+        <w:t xml:space="preserve">the sign and interpretation can flip depending on quote convention (American vs European terms). The safest approach is to define your quote clearly, compute ((F-S)/S), and interpret the meaning in words (</w:t>
+      </w:r>
+      <w:r>
+        <w:t xml:space="preserve">“more or fewer USD per 1 unit of foreign currency”</w:t>
+      </w:r>
+      <w:r>
+        <w:t xml:space="preserve">).</w:t>
+      </w:r>
+    </w:p>
+    <w:bookmarkEnd w:id="84"/>
+    <w:bookmarkEnd w:id="85"/>
+    <w:bookmarkStart w:id="86" w:name="possible-misconceptions"/>
+    <w:p>
+      <w:pPr>
+        <w:pStyle w:val="Heading3"/>
+      </w:pPr>
+      <w:r>
+        <w:t xml:space="preserve">5.4.7 Possible misconceptions</w:t>
+      </w:r>
+    </w:p>
+    <w:p>
+      <w:pPr>
+        <w:pStyle w:val="Compact"/>
+        <w:numPr>
+          <w:ilvl w:val="0"/>
           <w:numId w:val="1036"/>
         </w:numPr>
       </w:pPr>
       <w:r>
-        <w:t xml:space="preserve">If (F &gt; S): the foreign currency is at a</w:t>
-      </w:r>
-      <w:r>
-        <w:t xml:space="preserve"> </w:t>
-      </w:r>
-      <w:r>
-        <w:rPr>
-          <w:b/>
-          <w:bCs/>
-        </w:rPr>
-        <w:t xml:space="preserve">forward premium</w:t>
-      </w:r>
-      <w:r>
-        <w:t xml:space="preserve"> </w:t>
-      </w:r>
-      <w:r>
-        <w:t xml:space="preserve">(in American terms).</w:t>
+        <w:rPr>
+          <w:b/>
+          <w:bCs/>
+        </w:rPr>
+        <w:t xml:space="preserve">“Direct vs. indirect is the same as American vs. European.”</w:t>
+      </w:r>
+      <w:r>
+        <w:br/>
+      </w:r>
+      <w:r>
+        <w:t xml:space="preserve">They are related but not identical; direct/indirect depends on who is</w:t>
+      </w:r>
+      <w:r>
+        <w:t xml:space="preserve"> </w:t>
+      </w:r>
+      <w:r>
+        <w:t xml:space="preserve">“home.”</w:t>
       </w:r>
     </w:p>
     <w:p>
@@ -4455,94 +4436,6 @@
         <w:numPr>
           <w:ilvl w:val="0"/>
           <w:numId w:val="1036"/>
-        </w:numPr>
-      </w:pPr>
-      <w:r>
-        <w:t xml:space="preserve">If (F &lt; S): it is at a</w:t>
-      </w:r>
-      <w:r>
-        <w:t xml:space="preserve"> </w:t>
-      </w:r>
-      <w:r>
-        <w:rPr>
-          <w:b/>
-          <w:bCs/>
-        </w:rPr>
-        <w:t xml:space="preserve">forward discount</w:t>
-      </w:r>
-      <w:r>
-        <w:t xml:space="preserve">.</w:t>
-      </w:r>
-    </w:p>
-    <w:p>
-      <w:pPr>
-        <w:pStyle w:val="FirstParagraph"/>
-      </w:pPr>
-      <w:r>
-        <w:rPr>
-          <w:b/>
-          <w:bCs/>
-        </w:rPr>
-        <w:t xml:space="preserve">Important teaching note:</w:t>
-      </w:r>
-      <w:r>
-        <w:t xml:space="preserve"> </w:t>
-      </w:r>
-      <w:r>
-        <w:t xml:space="preserve">the sign and interpretation can flip depending on quote convention (American vs European terms). The safest approach is: define your quote clearly, compute ((F-S)/S), and interpret the meaning in words (</w:t>
-      </w:r>
-      <w:r>
-        <w:t xml:space="preserve">“more or fewer USD per 1 unit of foreign currency”</w:t>
-      </w:r>
-      <w:r>
-        <w:t xml:space="preserve">).</w:t>
-      </w:r>
-    </w:p>
-    <w:bookmarkEnd w:id="94"/>
-    <w:bookmarkEnd w:id="95"/>
-    <w:bookmarkStart w:id="96" w:name="likely-student-misconceptions-1"/>
-    <w:p>
-      <w:pPr>
-        <w:pStyle w:val="Heading3"/>
-      </w:pPr>
-      <w:r>
-        <w:t xml:space="preserve">5.4.7 Likely student misconceptions</w:t>
-      </w:r>
-    </w:p>
-    <w:p>
-      <w:pPr>
-        <w:pStyle w:val="Compact"/>
-        <w:numPr>
-          <w:ilvl w:val="0"/>
-          <w:numId w:val="1037"/>
-        </w:numPr>
-      </w:pPr>
-      <w:r>
-        <w:rPr>
-          <w:b/>
-          <w:bCs/>
-        </w:rPr>
-        <w:t xml:space="preserve">“Direct vs. indirect is the same as American vs. European.”</w:t>
-      </w:r>
-      <w:r>
-        <w:br/>
-      </w:r>
-      <w:r>
-        <w:t xml:space="preserve">They are related but not identical; direct/indirect depends on who is</w:t>
-      </w:r>
-      <w:r>
-        <w:t xml:space="preserve"> </w:t>
-      </w:r>
-      <w:r>
-        <w:t xml:space="preserve">“home.”</w:t>
-      </w:r>
-    </w:p>
-    <w:p>
-      <w:pPr>
-        <w:pStyle w:val="Compact"/>
-        <w:numPr>
-          <w:ilvl w:val="0"/>
-          <w:numId w:val="1037"/>
         </w:numPr>
       </w:pPr>
       <w:r>
@@ -4580,7 +4473,7 @@
         <w:pStyle w:val="Compact"/>
         <w:numPr>
           <w:ilvl w:val="0"/>
-          <w:numId w:val="1037"/>
+          <w:numId w:val="1036"/>
         </w:numPr>
       </w:pPr>
       <w:r>
@@ -4595,64 +4488,6 @@
       </w:r>
       <w:r>
         <w:t xml:space="preserve">Cross rates are unit algebra; always track currency units.</w:t>
-      </w:r>
-    </w:p>
-    <w:bookmarkEnd w:id="96"/>
-    <w:bookmarkStart w:id="97" w:name="check-for-understanding-1"/>
-    <w:p>
-      <w:pPr>
-        <w:pStyle w:val="Heading3"/>
-      </w:pPr>
-      <w:r>
-        <w:t xml:space="preserve">5.4.8 Check for understanding</w:t>
-      </w:r>
-    </w:p>
-    <w:p>
-      <w:pPr>
-        <w:pStyle w:val="Compact"/>
-        <w:numPr>
-          <w:ilvl w:val="0"/>
-          <w:numId w:val="1038"/>
-        </w:numPr>
-      </w:pPr>
-      <w:r>
-        <w:t xml:space="preserve">If EUR/USD is 1.10, what is USD/EUR?</w:t>
-      </w:r>
-      <w:r>
-        <w:br/>
-      </w:r>
-    </w:p>
-    <w:p>
-      <w:pPr>
-        <w:pStyle w:val="Compact"/>
-        <w:numPr>
-          <w:ilvl w:val="0"/>
-          <w:numId w:val="1038"/>
-        </w:numPr>
-      </w:pPr>
-      <w:r>
-        <w:t xml:space="preserve">If a dealer quotes EUR/USD 1.1000–1.1004, what price do you pay to buy euros?</w:t>
-      </w:r>
-    </w:p>
-    <w:p>
-      <w:pPr>
-        <w:pStyle w:val="Compact"/>
-        <w:numPr>
-          <w:ilvl w:val="0"/>
-          <w:numId w:val="1038"/>
-        </w:numPr>
-      </w:pPr>
-      <w:r>
-        <w:t xml:space="preserve">If the implied EUR/GBP differs from the quoted EUR/GBP, what additional information do you need before declaring</w:t>
-      </w:r>
-      <w:r>
-        <w:t xml:space="preserve"> </w:t>
-      </w:r>
-      <w:r>
-        <w:t xml:space="preserve">“free money”</w:t>
-      </w:r>
-      <w:r>
-        <w:t xml:space="preserve">?</w:t>
       </w:r>
     </w:p>
     <w:p>
@@ -4662,9 +4497,9 @@
         </w:pict>
       </w:r>
     </w:p>
-    <w:bookmarkEnd w:id="97"/>
-    <w:bookmarkEnd w:id="98"/>
-    <w:bookmarkStart w:id="99" w:name="summary"/>
+    <w:bookmarkEnd w:id="86"/>
+    <w:bookmarkEnd w:id="87"/>
+    <w:bookmarkStart w:id="88" w:name="summary"/>
     <w:p>
       <w:pPr>
         <w:pStyle w:val="Heading2"/>
@@ -4686,7 +4521,7 @@
         <w:pStyle w:val="Compact"/>
         <w:numPr>
           <w:ilvl w:val="0"/>
-          <w:numId w:val="1039"/>
+          <w:numId w:val="1037"/>
         </w:numPr>
       </w:pPr>
       <w:r>
@@ -4708,7 +4543,7 @@
         <w:pStyle w:val="Compact"/>
         <w:numPr>
           <w:ilvl w:val="0"/>
-          <w:numId w:val="1039"/>
+          <w:numId w:val="1037"/>
         </w:numPr>
       </w:pPr>
       <w:r>
@@ -4730,7 +4565,7 @@
         <w:pStyle w:val="Compact"/>
         <w:numPr>
           <w:ilvl w:val="0"/>
-          <w:numId w:val="1039"/>
+          <w:numId w:val="1037"/>
         </w:numPr>
       </w:pPr>
       <w:r>
@@ -4752,7 +4587,7 @@
         <w:pStyle w:val="Compact"/>
         <w:numPr>
           <w:ilvl w:val="0"/>
-          <w:numId w:val="1039"/>
+          <w:numId w:val="1037"/>
         </w:numPr>
       </w:pPr>
       <w:r>
@@ -4774,7 +4609,7 @@
         <w:pStyle w:val="Compact"/>
         <w:numPr>
           <w:ilvl w:val="0"/>
-          <w:numId w:val="1039"/>
+          <w:numId w:val="1037"/>
         </w:numPr>
       </w:pPr>
       <w:r>
@@ -4809,8 +4644,8 @@
         <w:t xml:space="preserve">given any FX quote, you can state (i) what is being priced, (ii) what you pay to buy and what you receive to sell, and (iii) how that quote maps into a real cash flow and risk exposure.</w:t>
       </w:r>
     </w:p>
-    <w:bookmarkEnd w:id="99"/>
-    <w:bookmarkEnd w:id="100"/>
+    <w:bookmarkEnd w:id="88"/>
+    <w:bookmarkEnd w:id="89"/>
     <w:sectPr>
       <w:footnotePr>
         <w:numRestart w:val="eachSect"/>
@@ -5383,34 +5218,7 @@
     <w:abstractNumId w:val="991"/>
   </w:num>
   <w:num w:numId="1028">
-    <w:abstractNumId w:val="99411"/>
-    <w:lvlOverride w:ilvl="0">
-      <w:startOverride w:val="1"/>
-    </w:lvlOverride>
-    <w:lvlOverride w:ilvl="1">
-      <w:startOverride w:val="1"/>
-    </w:lvlOverride>
-    <w:lvlOverride w:ilvl="2">
-      <w:startOverride w:val="1"/>
-    </w:lvlOverride>
-    <w:lvlOverride w:ilvl="3">
-      <w:startOverride w:val="1"/>
-    </w:lvlOverride>
-    <w:lvlOverride w:ilvl="4">
-      <w:startOverride w:val="1"/>
-    </w:lvlOverride>
-    <w:lvlOverride w:ilvl="5">
-      <w:startOverride w:val="1"/>
-    </w:lvlOverride>
-    <w:lvlOverride w:ilvl="6">
-      <w:startOverride w:val="1"/>
-    </w:lvlOverride>
-    <w:lvlOverride w:ilvl="7">
-      <w:startOverride w:val="1"/>
-    </w:lvlOverride>
-    <w:lvlOverride w:ilvl="8">
-      <w:startOverride w:val="1"/>
-    </w:lvlOverride>
+    <w:abstractNumId w:val="991"/>
   </w:num>
   <w:num w:numId="1029">
     <w:abstractNumId w:val="991"/>
@@ -5425,37 +5233,37 @@
     <w:abstractNumId w:val="991"/>
   </w:num>
   <w:num w:numId="1033">
-    <w:abstractNumId w:val="991"/>
+    <w:abstractNumId w:val="99411"/>
+    <w:lvlOverride w:ilvl="0">
+      <w:startOverride w:val="1"/>
+    </w:lvlOverride>
+    <w:lvlOverride w:ilvl="1">
+      <w:startOverride w:val="1"/>
+    </w:lvlOverride>
+    <w:lvlOverride w:ilvl="2">
+      <w:startOverride w:val="1"/>
+    </w:lvlOverride>
+    <w:lvlOverride w:ilvl="3">
+      <w:startOverride w:val="1"/>
+    </w:lvlOverride>
+    <w:lvlOverride w:ilvl="4">
+      <w:startOverride w:val="1"/>
+    </w:lvlOverride>
+    <w:lvlOverride w:ilvl="5">
+      <w:startOverride w:val="1"/>
+    </w:lvlOverride>
+    <w:lvlOverride w:ilvl="6">
+      <w:startOverride w:val="1"/>
+    </w:lvlOverride>
+    <w:lvlOverride w:ilvl="7">
+      <w:startOverride w:val="1"/>
+    </w:lvlOverride>
+    <w:lvlOverride w:ilvl="8">
+      <w:startOverride w:val="1"/>
+    </w:lvlOverride>
   </w:num>
   <w:num w:numId="1034">
-    <w:abstractNumId w:val="99411"/>
-    <w:lvlOverride w:ilvl="0">
-      <w:startOverride w:val="1"/>
-    </w:lvlOverride>
-    <w:lvlOverride w:ilvl="1">
-      <w:startOverride w:val="1"/>
-    </w:lvlOverride>
-    <w:lvlOverride w:ilvl="2">
-      <w:startOverride w:val="1"/>
-    </w:lvlOverride>
-    <w:lvlOverride w:ilvl="3">
-      <w:startOverride w:val="1"/>
-    </w:lvlOverride>
-    <w:lvlOverride w:ilvl="4">
-      <w:startOverride w:val="1"/>
-    </w:lvlOverride>
-    <w:lvlOverride w:ilvl="5">
-      <w:startOverride w:val="1"/>
-    </w:lvlOverride>
-    <w:lvlOverride w:ilvl="6">
-      <w:startOverride w:val="1"/>
-    </w:lvlOverride>
-    <w:lvlOverride w:ilvl="7">
-      <w:startOverride w:val="1"/>
-    </w:lvlOverride>
-    <w:lvlOverride w:ilvl="8">
-      <w:startOverride w:val="1"/>
-    </w:lvlOverride>
+    <w:abstractNumId w:val="991"/>
   </w:num>
   <w:num w:numId="1035">
     <w:abstractNumId w:val="991"/>
@@ -5464,39 +5272,6 @@
     <w:abstractNumId w:val="991"/>
   </w:num>
   <w:num w:numId="1037">
-    <w:abstractNumId w:val="991"/>
-  </w:num>
-  <w:num w:numId="1038">
-    <w:abstractNumId w:val="99411"/>
-    <w:lvlOverride w:ilvl="0">
-      <w:startOverride w:val="1"/>
-    </w:lvlOverride>
-    <w:lvlOverride w:ilvl="1">
-      <w:startOverride w:val="1"/>
-    </w:lvlOverride>
-    <w:lvlOverride w:ilvl="2">
-      <w:startOverride w:val="1"/>
-    </w:lvlOverride>
-    <w:lvlOverride w:ilvl="3">
-      <w:startOverride w:val="1"/>
-    </w:lvlOverride>
-    <w:lvlOverride w:ilvl="4">
-      <w:startOverride w:val="1"/>
-    </w:lvlOverride>
-    <w:lvlOverride w:ilvl="5">
-      <w:startOverride w:val="1"/>
-    </w:lvlOverride>
-    <w:lvlOverride w:ilvl="6">
-      <w:startOverride w:val="1"/>
-    </w:lvlOverride>
-    <w:lvlOverride w:ilvl="7">
-      <w:startOverride w:val="1"/>
-    </w:lvlOverride>
-    <w:lvlOverride w:ilvl="8">
-      <w:startOverride w:val="1"/>
-    </w:lvlOverride>
-  </w:num>
-  <w:num w:numId="1039">
     <w:abstractNumId w:val="991"/>
   </w:num>
 </w:numbering>

</xml_diff>